<commit_message>
Redefine Mise en Place: food + drink, equally (one-pager v2)
Broadens MeP from drink-forward to a celebration of the whole table — food
and drink equally — per the strategic rethink: Gen Z drinks less,
breakfast/lunch aren't drinking occasions, and the celebratory everyday-
restaurant lane is open (FaaV won't spotlight a Choo Choo BBQ; TFP's food
newsletter is paywalled; NOOGAtoday is broad listings). Adds the editorial
credo ("the line": celebrate the craft, delight over didactics, politics
off the plate, always useful, celebratory != paid), the three-way
competitive wedge (FaaV / TFP / NOOGAtoday), all-dayparts + sober-curious
logic, twin content signatures (The Plate / The Pour), a broadened sponsor
base, the Bill Reed/Pedestrian wine-dinner event model, and a note to
retire "The Table" (it's FaaV's brand).

Co-Authored-By: Claude Opus 4.8 (1M context) <noreply@anthropic.com>
Claude-Session: https://claude.ai/code/session_01MZCcvfRxTVSc6PAak7p1Nw
</commit_message>
<xml_diff>
--- a/Mise_en_Place_One_Pager.docx
+++ b/Mise_en_Place_One_Pager.docx
@@ -24,9 +24,9 @@
         <w:rPr>
           <w:i/>
           <w:color w:val="2A2420"/>
-          <w:sz w:val="28"/>
+          <w:sz w:val="27"/>
         </w:rPr>
-        <w:t>Chattanooga's wine, beer, bourbon &amp; the table</w:t>
+        <w:t>Eat well, drink well, Chattanooga — and meet the people who make it.</w:t>
       </w:r>
     </w:p>
     <w:p>
@@ -39,7 +39,7 @@
           <w:color w:val="8A7F70"/>
           <w:sz w:val="18"/>
         </w:rPr>
-        <w:t>Positioning one-pager  ·  the openly-sponsored companion to Scenic City Insider  ·  project name “MeP” (pending name vetting)</w:t>
+        <w:t>Positioning one-pager (v2: food + drink, equally)  ·  the openly-sponsored companion to Scenic City Insider  ·  project name “MeP” (pending name vetting)</w:t>
       </w:r>
     </w:p>
     <w:p/>
@@ -56,7 +56,7 @@
           <w:color w:val="6E2B39"/>
           <w:sz w:val="29"/>
         </w:rPr>
-        <w:t>The verdict, and the pivot</w:t>
+        <w:t>What MeP is</w:t>
       </w:r>
     </w:p>
     <w:p>
@@ -65,55 +65,18 @@
       </w:pPr>
       <w:r>
         <w:rPr>
-          <w:i w:val="0"/>
-          <w:sz w:val="20"/>
-        </w:rPr>
-        <w:t xml:space="preserve">A pressure-test of the Chattanooga market says: </w:t>
-      </w:r>
-      <w:r>
-        <w:rPr>
           <w:b/>
           <w:i w:val="0"/>
           <w:sz w:val="20"/>
         </w:rPr>
-        <w:t>a general food newsletter is a weak bet</w:t>
+        <w:t>Chattanooga's celebration of the table — food and drink, equally — and the people who make it worth it.</w:t>
       </w:r>
       <w:r>
         <w:rPr>
           <w:i w:val="0"/>
           <w:sz w:val="20"/>
         </w:rPr>
-        <w:t xml:space="preserve"> — that lane is already taken (Food as a Verb, the Times Free Press's paid 'What to Eat Next,' and NOOGAtoday's daily food coverage). But </w:t>
-      </w:r>
-      <w:r>
-        <w:rPr>
-          <w:b/>
-          <w:i w:val="0"/>
-          <w:sz w:val="20"/>
-        </w:rPr>
-        <w:t>drinks are wide open</w:t>
-      </w:r>
-      <w:r>
-        <w:rPr>
-          <w:i w:val="0"/>
-          <w:sz w:val="20"/>
-        </w:rPr>
-        <w:t xml:space="preserve">: there is no dedicated local wine, beer, or bourbon publication, despite a city that genuinely loves all three. So MeP leads with </w:t>
-      </w:r>
-      <w:r>
-        <w:rPr>
-          <w:b/>
-          <w:i w:val="0"/>
-          <w:sz w:val="20"/>
-        </w:rPr>
-        <w:t>the glass and the table</w:t>
-      </w:r>
-      <w:r>
-        <w:rPr>
-          <w:i w:val="0"/>
-          <w:sz w:val="20"/>
-        </w:rPr>
-        <w:t xml:space="preserve"> — wine, beer, bourbon, and the food and hosting around them — not restaurant reviews. The market gap and the founder's real passion point at the same place.</w:t>
+        <w:t xml:space="preserve"> Joyful, useful, free, and unapologetically apolitical. It celebrates the *craft* of cooking, pouring, and serving — the chef, the bartender, the baker, the shop owner — and pairs that with a credentialed drinks beat (wine, beer, bourbon, and the no/low-ABV side) that no one else in town has. The drink is one door into the room; the plate is the other.</w:t>
       </w:r>
     </w:p>
     <w:p>
@@ -127,7 +90,7 @@
           <w:color w:val="6B5F53"/>
           <w:sz w:val="20"/>
         </w:rPr>
-        <w:t>The promise, true to the name:</w:t>
+        <w:t>Why food *and* drink, not drink alone:</w:t>
       </w:r>
       <w:r>
         <w:rPr>
@@ -135,8 +98,426 @@
           <w:color w:val="6B5F53"/>
           <w:sz w:val="20"/>
         </w:rPr>
-        <w:t xml:space="preserve"> everything in its place. The weekly that gets you ready to drink well, pair well, and host well — calm readiness for the good life at the table.</w:t>
+        <w:t xml:space="preserve"> the audience is bigger and the publication is sturdier. Gen Z drinks less; breakfast and lunch aren't drinking occasions; and many of the best stories are simply a great plate. Going food-equal opens the whole clock — biscuit to nightcap — widens the audience (including the sober-curious), and broadens the sponsor base (roasters, bakeries, daytime spots) well beyond bottle shops.</w:t>
       </w:r>
+    </w:p>
+    <w:p>
+      <w:pPr>
+        <w:spacing w:before="240" w:after="60"/>
+        <w:pBdr>
+          <w:bottom w:val="single" w:sz="6" w:space="2" w:color="B5722E"/>
+        </w:pBdr>
+      </w:pPr>
+      <w:r>
+        <w:rPr>
+          <w:b/>
+          <w:color w:val="6E2B39"/>
+          <w:sz w:val="29"/>
+        </w:rPr>
+        <w:t>The line — MeP's editorial DNA</w:t>
+      </w:r>
+    </w:p>
+    <w:p>
+      <w:pPr>
+        <w:pStyle w:val="ListBullet"/>
+        <w:spacing w:after="60"/>
+      </w:pPr>
+      <w:r>
+        <w:rPr>
+          <w:b/>
+          <w:sz w:val="19"/>
+        </w:rPr>
+        <w:t>Celebrate the craft.</w:t>
+      </w:r>
+      <w:r>
+        <w:rPr>
+          <w:sz w:val="19"/>
+        </w:rPr>
+        <w:t xml:space="preserve"> Cover people for what they make and the joy they create — never as a cause.</w:t>
+      </w:r>
+    </w:p>
+    <w:p>
+      <w:pPr>
+        <w:pStyle w:val="ListBullet"/>
+        <w:spacing w:after="60"/>
+      </w:pPr>
+      <w:r>
+        <w:rPr>
+          <w:b/>
+          <w:sz w:val="19"/>
+        </w:rPr>
+        <w:t>Delight over didactics.</w:t>
+      </w:r>
+      <w:r>
+        <w:rPr>
+          <w:sz w:val="19"/>
+        </w:rPr>
+        <w:t xml:space="preserve"> We're here for the pleasure of the table, not the lecture.</w:t>
+      </w:r>
+    </w:p>
+    <w:p>
+      <w:pPr>
+        <w:pStyle w:val="ListBullet"/>
+        <w:spacing w:after="60"/>
+      </w:pPr>
+      <w:r>
+        <w:rPr>
+          <w:b/>
+          <w:sz w:val="19"/>
+        </w:rPr>
+        <w:t>Politics off the plate.</w:t>
+      </w:r>
+      <w:r>
+        <w:rPr>
+          <w:sz w:val="19"/>
+        </w:rPr>
+        <w:t xml:space="preserve"> Everyone's welcome at this table. No agenda but a good one — never an activist rant, even a right one.</w:t>
+      </w:r>
+    </w:p>
+    <w:p>
+      <w:pPr>
+        <w:pStyle w:val="ListBullet"/>
+        <w:spacing w:after="60"/>
+      </w:pPr>
+      <w:r>
+        <w:rPr>
+          <w:b/>
+          <w:sz w:val="19"/>
+        </w:rPr>
+        <w:t>Always useful.</w:t>
+      </w:r>
+      <w:r>
+        <w:rPr>
+          <w:sz w:val="19"/>
+        </w:rPr>
+        <w:t xml:space="preserve"> Where to eat and drink, what to order, what's new, who to know.</w:t>
+      </w:r>
+    </w:p>
+    <w:p>
+      <w:pPr>
+        <w:pStyle w:val="ListBullet"/>
+        <w:spacing w:after="60"/>
+      </w:pPr>
+      <w:r>
+        <w:rPr>
+          <w:b/>
+          <w:sz w:val="19"/>
+        </w:rPr>
+        <w:t>The plate and the glass are both the door</w:t>
+      </w:r>
+      <w:r>
+        <w:rPr>
+          <w:sz w:val="19"/>
+        </w:rPr>
+        <w:t xml:space="preserve"> — and we walk through to meet the people behind the bar and the stove.</w:t>
+      </w:r>
+    </w:p>
+    <w:p>
+      <w:pPr>
+        <w:pStyle w:val="ListBullet"/>
+        <w:spacing w:after="60"/>
+      </w:pPr>
+      <w:r>
+        <w:rPr>
+          <w:b/>
+          <w:sz w:val="19"/>
+        </w:rPr>
+        <w:t>Celebratory ≠ paid.</w:t>
+      </w:r>
+      <w:r>
+        <w:rPr>
+          <w:sz w:val="19"/>
+        </w:rPr>
+        <w:t xml:space="preserve"> We celebrate because it earned it, not because someone bought a slot (same bright line as everything we do).</w:t>
+      </w:r>
+    </w:p>
+    <w:p>
+      <w:pPr>
+        <w:spacing w:before="240" w:after="60"/>
+        <w:pBdr>
+          <w:bottom w:val="single" w:sz="6" w:space="2" w:color="B5722E"/>
+        </w:pBdr>
+      </w:pPr>
+      <w:r>
+        <w:rPr>
+          <w:b/>
+          <w:color w:val="6E2B39"/>
+          <w:sz w:val="29"/>
+        </w:rPr>
+        <w:t>Why the lane is open — the competitive wedge</w:t>
+      </w:r>
+    </w:p>
+    <w:p>
+      <w:pPr>
+        <w:spacing w:after="120"/>
+      </w:pPr>
+      <w:r>
+        <w:rPr>
+          <w:i w:val="0"/>
+          <w:sz w:val="20"/>
+        </w:rPr>
+        <w:t>A general food newsletter would be a weak bet — that's crowded. But the *celebratory, craft-and-people, genuinely useful, free, apolitical, drinks-expert* lane is open, because each incumbent leaves it empty:</w:t>
+      </w:r>
+    </w:p>
+    <w:tbl>
+      <w:tblPr>
+        <w:tblStyle w:val="TableGrid"/>
+        <w:tblW w:type="auto" w:w="0"/>
+        <w:jc w:val="center"/>
+        <w:tblLook w:firstColumn="1" w:firstRow="1" w:lastColumn="0" w:lastRow="0" w:noHBand="0" w:noVBand="1" w:val="04A0"/>
+      </w:tblPr>
+      <w:tblGrid>
+        <w:gridCol w:w="3264"/>
+        <w:gridCol w:w="3264"/>
+        <w:gridCol w:w="3264"/>
+      </w:tblGrid>
+      <w:tr>
+        <w:tc>
+          <w:tcPr>
+            <w:tcW w:type="dxa" w:w="2160"/>
+            <w:shd w:val="clear" w:color="auto" w:fill="6E2B39"/>
+          </w:tcPr>
+          <w:p>
+            <w:pPr>
+              <w:jc w:val="left"/>
+            </w:pPr>
+            <w:r/>
+            <w:r>
+              <w:rPr>
+                <w:b/>
+                <w:color w:val="FFFFFF"/>
+                <w:sz w:val="17"/>
+              </w:rPr>
+              <w:t>Incumbent</w:t>
+            </w:r>
+          </w:p>
+        </w:tc>
+        <w:tc>
+          <w:tcPr>
+            <w:tcW w:type="dxa" w:w="3168"/>
+            <w:shd w:val="clear" w:color="auto" w:fill="6E2B39"/>
+          </w:tcPr>
+          <w:p>
+            <w:pPr>
+              <w:jc w:val="left"/>
+            </w:pPr>
+            <w:r/>
+            <w:r>
+              <w:rPr>
+                <w:b/>
+                <w:color w:val="FFFFFF"/>
+                <w:sz w:val="17"/>
+              </w:rPr>
+              <w:t>What they are</w:t>
+            </w:r>
+          </w:p>
+        </w:tc>
+        <w:tc>
+          <w:tcPr>
+            <w:tcW w:type="dxa" w:w="4752"/>
+            <w:shd w:val="clear" w:color="auto" w:fill="6E2B39"/>
+          </w:tcPr>
+          <w:p>
+            <w:pPr>
+              <w:jc w:val="left"/>
+            </w:pPr>
+            <w:r/>
+            <w:r>
+              <w:rPr>
+                <w:b/>
+                <w:color w:val="FFFFFF"/>
+                <w:sz w:val="17"/>
+              </w:rPr>
+              <w:t>MeP's wedge</w:t>
+            </w:r>
+          </w:p>
+        </w:tc>
+      </w:tr>
+      <w:tr>
+        <w:tc>
+          <w:tcPr>
+            <w:tcW w:type="dxa" w:w="2160"/>
+            <w:shd w:val="clear" w:color="auto" w:fill="FAF4E9"/>
+          </w:tcPr>
+          <w:p>
+            <w:pPr>
+              <w:jc w:val="left"/>
+            </w:pPr>
+            <w:r/>
+            <w:r>
+              <w:rPr>
+                <w:b/>
+                <w:color w:val="2A2420"/>
+                <w:sz w:val="16"/>
+              </w:rPr>
+              <w:t>Food as a Verb</w:t>
+            </w:r>
+          </w:p>
+        </w:tc>
+        <w:tc>
+          <w:tcPr>
+            <w:tcW w:type="dxa" w:w="3168"/>
+            <w:shd w:val="clear" w:color="auto" w:fill="FAF4E9"/>
+          </w:tcPr>
+          <w:p>
+            <w:pPr>
+              <w:jc w:val="left"/>
+            </w:pPr>
+            <w:r/>
+            <w:r>
+              <w:rPr>
+                <w:b w:val="0"/>
+                <w:sz w:val="16"/>
+              </w:rPr>
+              <w:t>Food-as-society / agrarian, literary, activist</w:t>
+            </w:r>
+          </w:p>
+        </w:tc>
+        <w:tc>
+          <w:tcPr>
+            <w:tcW w:type="dxa" w:w="4752"/>
+            <w:shd w:val="clear" w:color="auto" w:fill="FAF4E9"/>
+          </w:tcPr>
+          <w:p>
+            <w:pPr>
+              <w:jc w:val="left"/>
+            </w:pPr>
+            <w:r/>
+            <w:r>
+              <w:rPr>
+                <w:b w:val="0"/>
+                <w:sz w:val="16"/>
+              </w:rPr>
+              <w:t>We celebrate the craft &amp; the joy — the everyday beloved spot, the cook, the bartender — plus a drinks beat &amp; service. Never a lecture. (They'll never spotlight a Choo Choo BBQ; we will.)</w:t>
+            </w:r>
+          </w:p>
+        </w:tc>
+      </w:tr>
+      <w:tr>
+        <w:tc>
+          <w:tcPr>
+            <w:tcW w:type="dxa" w:w="2160"/>
+            <w:shd w:val="clear" w:color="auto" w:fill="FFFFFF"/>
+          </w:tcPr>
+          <w:p>
+            <w:pPr>
+              <w:jc w:val="left"/>
+            </w:pPr>
+            <w:r/>
+            <w:r>
+              <w:rPr>
+                <w:b/>
+                <w:color w:val="2A2420"/>
+                <w:sz w:val="16"/>
+              </w:rPr>
+              <w:t>Times Free Press 'What to Eat Next'</w:t>
+            </w:r>
+          </w:p>
+        </w:tc>
+        <w:tc>
+          <w:tcPr>
+            <w:tcW w:type="dxa" w:w="3168"/>
+            <w:shd w:val="clear" w:color="auto" w:fill="FFFFFF"/>
+          </w:tcPr>
+          <w:p>
+            <w:pPr>
+              <w:jc w:val="left"/>
+            </w:pPr>
+            <w:r/>
+            <w:r>
+              <w:rPr>
+                <w:b w:val="0"/>
+                <w:sz w:val="16"/>
+              </w:rPr>
+              <w:t>Curated food, but paywalled / limited access</w:t>
+            </w:r>
+          </w:p>
+        </w:tc>
+        <w:tc>
+          <w:tcPr>
+            <w:tcW w:type="dxa" w:w="4752"/>
+            <w:shd w:val="clear" w:color="auto" w:fill="FFFFFF"/>
+          </w:tcPr>
+          <w:p>
+            <w:pPr>
+              <w:jc w:val="left"/>
+            </w:pPr>
+            <w:r/>
+            <w:r>
+              <w:rPr>
+                <w:b w:val="0"/>
+                <w:sz w:val="16"/>
+              </w:rPr>
+              <w:t>Free — reaches the whole city, not just subscribers.</w:t>
+            </w:r>
+          </w:p>
+        </w:tc>
+      </w:tr>
+      <w:tr>
+        <w:tc>
+          <w:tcPr>
+            <w:tcW w:type="dxa" w:w="2160"/>
+            <w:shd w:val="clear" w:color="auto" w:fill="FAF4E9"/>
+          </w:tcPr>
+          <w:p>
+            <w:pPr>
+              <w:jc w:val="left"/>
+            </w:pPr>
+            <w:r/>
+            <w:r>
+              <w:rPr>
+                <w:b/>
+                <w:color w:val="2A2420"/>
+                <w:sz w:val="16"/>
+              </w:rPr>
+              <w:t>NOOGAtoday</w:t>
+            </w:r>
+          </w:p>
+        </w:tc>
+        <w:tc>
+          <w:tcPr>
+            <w:tcW w:type="dxa" w:w="3168"/>
+            <w:shd w:val="clear" w:color="auto" w:fill="FAF4E9"/>
+          </w:tcPr>
+          <w:p>
+            <w:pPr>
+              <w:jc w:val="left"/>
+            </w:pPr>
+            <w:r/>
+            <w:r>
+              <w:rPr>
+                <w:b w:val="0"/>
+                <w:sz w:val="16"/>
+              </w:rPr>
+              <w:t>Broad daily news; food is one section + ad roundups</w:t>
+            </w:r>
+          </w:p>
+        </w:tc>
+        <w:tc>
+          <w:tcPr>
+            <w:tcW w:type="dxa" w:w="4752"/>
+            <w:shd w:val="clear" w:color="auto" w:fill="FAF4E9"/>
+          </w:tcPr>
+          <w:p>
+            <w:pPr>
+              <w:jc w:val="left"/>
+            </w:pPr>
+            <w:r/>
+            <w:r>
+              <w:rPr>
+                <w:b w:val="0"/>
+                <w:sz w:val="16"/>
+              </w:rPr>
+              <w:t>Dedicated, celebratory, craft-deep — with a credential-backed drinks beat none of them have.</w:t>
+            </w:r>
+          </w:p>
+        </w:tc>
+      </w:tr>
+    </w:tbl>
+    <w:p>
+      <w:pPr>
+        <w:spacing w:after="40"/>
+      </w:pPr>
     </w:p>
     <w:p>
       <w:pPr>
@@ -193,7 +574,7 @@
           <w:i w:val="0"/>
           <w:sz w:val="20"/>
         </w:rPr>
-        <w:t xml:space="preserve"> of the company — no ads, the reader is the customer. </w:t>
+        <w:t xml:space="preserve"> — no ads, the reader is the customer. </w:t>
       </w:r>
       <w:r>
         <w:rPr>
@@ -208,107 +589,7 @@
           <w:i w:val="0"/>
           <w:sz w:val="20"/>
         </w:rPr>
-        <w:t xml:space="preserve"> — clearly labeled sponsors and ticketed events. Two mastheads, two honest models. SCI may mention a restaurant as part of knowing the city; MeP is the dedicated drinks-and-table obsession with events. Keep them distinct or both blur.</w:t>
-      </w:r>
-    </w:p>
-    <w:p>
-      <w:pPr>
-        <w:spacing w:before="240" w:after="60"/>
-        <w:pBdr>
-          <w:bottom w:val="single" w:sz="6" w:space="2" w:color="B5722E"/>
-        </w:pBdr>
-      </w:pPr>
-      <w:r>
-        <w:rPr>
-          <w:b/>
-          <w:color w:val="6E2B39"/>
-          <w:sz w:val="29"/>
-        </w:rPr>
-        <w:t>Why it works here — three real advantages</w:t>
-      </w:r>
-    </w:p>
-    <w:p>
-      <w:pPr>
-        <w:pStyle w:val="ListBullet"/>
-        <w:spacing w:after="60"/>
-      </w:pPr>
-      <w:r>
-        <w:rPr>
-          <w:b/>
-          <w:sz w:val="19"/>
-        </w:rPr>
-        <w:t>A structural sponsor moat: Tennessee bans liquor-store chains.</w:t>
-      </w:r>
-      <w:r>
-        <w:rPr>
-          <w:sz w:val="19"/>
-        </w:rPr>
-        <w:t xml:space="preserve"> No Total Wine, no Costco wine — so the ~20–30 metro bottle shops are *all locally owned*, competing on curation, and need exactly this curated audience. Several already run tastings (Riverside, Imbibe, Kanku's). That anchor sponsor base wouldn't exist in a chain market.</w:t>
-      </w:r>
-    </w:p>
-    <w:p>
-      <w:pPr>
-        <w:pStyle w:val="ListBullet"/>
-        <w:spacing w:after="60"/>
-      </w:pPr>
-      <w:r>
-        <w:rPr>
-          <w:b/>
-          <w:sz w:val="19"/>
-        </w:rPr>
-        <w:t>A deep beer &amp; bourbon scene</w:t>
-      </w:r>
-      <w:r>
-        <w:rPr>
-          <w:sz w:val="19"/>
-        </w:rPr>
-        <w:t xml:space="preserve"> — 12–16 craft breweries plus Chattanooga Whiskey and Gate 11 distillery — widens the sponsor and event-partner base well beyond wine.</w:t>
-      </w:r>
-    </w:p>
-    <w:p>
-      <w:pPr>
-        <w:pStyle w:val="ListBullet"/>
-        <w:spacing w:after="60"/>
-      </w:pPr>
-      <w:r>
-        <w:rPr>
-          <w:b/>
-          <w:sz w:val="19"/>
-        </w:rPr>
-        <w:t>A vibrant, credentialed food scene</w:t>
-      </w:r>
-      <w:r>
-        <w:rPr>
-          <w:sz w:val="19"/>
-        </w:rPr>
-        <w:t xml:space="preserve"> (4 Michelin nods; James Beard 2026 semifinalists Niedlov's &amp; Calliope; a packed festival calendar) supplies endless 'where to drink well' content and event partners.</w:t>
-      </w:r>
-    </w:p>
-    <w:p>
-      <w:pPr>
-        <w:spacing w:after="120"/>
-      </w:pPr>
-      <w:r>
-        <w:rPr>
-          <w:i w:val="0"/>
-          <w:sz w:val="20"/>
-        </w:rPr>
-        <w:t xml:space="preserve">And the multiplier: MeP is one of three surfaces of a single personal brand — </w:t>
-      </w:r>
-      <w:r>
-        <w:rPr>
-          <w:b/>
-          <w:i w:val="0"/>
-          <w:sz w:val="20"/>
-        </w:rPr>
-        <w:t>the book (authority), the podcast (reach + relationships), the newsletter (the hub that owns the list and monetizes it).</w:t>
-      </w:r>
-      <w:r>
-        <w:rPr>
-          <w:i w:val="0"/>
-          <w:sz w:val="20"/>
-        </w:rPr>
-        <w:t xml:space="preserve"> Every winemaker, brewer, and shop owner is a guest, a sponsor, and a story.</w:t>
+        <w:t xml:space="preserve"> — labeled sponsors and ticketed events. SCI may mention a place as part of knowing the city; MeP is the dedicated eat-and-drink-well celebration with events. Two mastheads, two honest models.</w:t>
       </w:r>
     </w:p>
     <w:p>
@@ -437,7 +718,7 @@
                 <w:b w:val="0"/>
                 <w:sz w:val="17"/>
               </w:rPr>
-              <w:t>Ticketed tasting dinners, wine/whiskey classes, brewery &amp; maker collaborations</w:t>
+              <w:t>Intimate wine/whiskey dinners (the Bill Reed / Pedestrian model — 20–40 seats, a shop or somm + a kitchen), tastings, and classes</w:t>
             </w:r>
           </w:p>
         </w:tc>
@@ -456,7 +737,7 @@
                 <w:b w:val="0"/>
                 <w:sz w:val="17"/>
               </w:rPr>
-              <w:t>Highest margin, most on-brand; partner with a bottle shop + chef who supply at cost or rev-share. Illustrative: a 24-seat dinner at ~$125 ≈ $3K gross.</w:t>
+              <w:t>Highest margin, most on-brand; you host with credentials; scarcity &amp; access are the product. A 24-seat dinner at ~$125 ≈ $3K gross. The night is also the week's best content.</w:t>
             </w:r>
           </w:p>
         </w:tc>
@@ -497,7 +778,7 @@
                 <w:b w:val="0"/>
                 <w:sz w:val="17"/>
               </w:rPr>
-              <w:t>Presenting sponsor + category slots, anchored by bottle shops</w:t>
+              <w:t>Presenting + category slots; bottle shops anchor, now joined by restaurants, roasters, bakeries, cookware</w:t>
             </w:r>
           </w:p>
         </w:tc>
@@ -516,7 +797,7 @@
                 <w:b w:val="0"/>
                 <w:sz w:val="17"/>
               </w:rPr>
-              <w:t>~15–30 realistic local buyers at modest regional rates; bottle shops are the spine, with cookware, cheese, coffee, a distillery in support.</w:t>
+              <w:t>Going food-equal widens the pool well past wine/spirits; ~20–40 realistic local buyers at modest regional rates.</w:t>
             </w:r>
           </w:p>
         </w:tc>
@@ -606,7 +887,7 @@
           <w:color w:val="6B5F53"/>
           <w:sz w:val="19"/>
         </w:rPr>
-        <w:t xml:space="preserve"> a lifestyle-scale business — a devoted few-thousand list, 15–30 modest sponsors, and </w:t>
+        <w:t xml:space="preserve"> a lifestyle-scale business — a devoted few-thousand list and </w:t>
       </w:r>
       <w:r>
         <w:rPr>
@@ -623,8 +904,329 @@
           <w:color w:val="6B5F53"/>
           <w:sz w:val="19"/>
         </w:rPr>
-        <w:t xml:space="preserve"> Pure sponsorship alone rates Moderate; the blend (esp. events) rates Moderate-to-Strong.</w:t>
+        <w:t xml:space="preserve"> The blend (esp. events) is what makes it work; the certifications (WSET/bourbon) let *you* lead the rooms.</w:t>
       </w:r>
+    </w:p>
+    <w:p>
+      <w:pPr>
+        <w:spacing w:before="240" w:after="60"/>
+        <w:pBdr>
+          <w:bottom w:val="single" w:sz="6" w:space="2" w:color="B5722E"/>
+        </w:pBdr>
+      </w:pPr>
+      <w:r>
+        <w:rPr>
+          <w:b/>
+          <w:color w:val="6E2B39"/>
+          <w:sz w:val="29"/>
+        </w:rPr>
+        <w:t>The weekly — content architecture (twin signatures)</w:t>
+      </w:r>
+    </w:p>
+    <w:tbl>
+      <w:tblPr>
+        <w:tblStyle w:val="TableGrid"/>
+        <w:tblW w:type="auto" w:w="0"/>
+        <w:jc w:val="center"/>
+        <w:tblLook w:firstColumn="1" w:firstRow="1" w:lastColumn="0" w:lastRow="0" w:noHBand="0" w:noVBand="1" w:val="04A0"/>
+      </w:tblPr>
+      <w:tblGrid>
+        <w:gridCol w:w="4896"/>
+        <w:gridCol w:w="4896"/>
+      </w:tblGrid>
+      <w:tr>
+        <w:tc>
+          <w:tcPr>
+            <w:tcW w:type="dxa" w:w="2160"/>
+            <w:shd w:val="clear" w:color="auto" w:fill="6E2B39"/>
+          </w:tcPr>
+          <w:p>
+            <w:pPr>
+              <w:jc w:val="left"/>
+            </w:pPr>
+            <w:r/>
+            <w:r>
+              <w:rPr>
+                <w:b/>
+                <w:color w:val="FFFFFF"/>
+                <w:sz w:val="17"/>
+              </w:rPr>
+              <w:t>Section</w:t>
+            </w:r>
+          </w:p>
+        </w:tc>
+        <w:tc>
+          <w:tcPr>
+            <w:tcW w:type="dxa" w:w="7488"/>
+            <w:shd w:val="clear" w:color="auto" w:fill="6E2B39"/>
+          </w:tcPr>
+          <w:p>
+            <w:pPr>
+              <w:jc w:val="left"/>
+            </w:pPr>
+            <w:r/>
+            <w:r>
+              <w:rPr>
+                <w:b/>
+                <w:color w:val="FFFFFF"/>
+                <w:sz w:val="17"/>
+              </w:rPr>
+              <w:t>The point of view</w:t>
+            </w:r>
+          </w:p>
+        </w:tc>
+      </w:tr>
+      <w:tr>
+        <w:tc>
+          <w:tcPr>
+            <w:tcW w:type="dxa" w:w="2160"/>
+            <w:shd w:val="clear" w:color="auto" w:fill="FAF4E9"/>
+          </w:tcPr>
+          <w:p>
+            <w:pPr>
+              <w:jc w:val="left"/>
+            </w:pPr>
+            <w:r/>
+            <w:r>
+              <w:rPr>
+                <w:b/>
+                <w:color w:val="2A2420"/>
+                <w:sz w:val="17"/>
+              </w:rPr>
+              <w:t>The Plate</w:t>
+            </w:r>
+          </w:p>
+        </w:tc>
+        <w:tc>
+          <w:tcPr>
+            <w:tcW w:type="dxa" w:w="7488"/>
+            <w:shd w:val="clear" w:color="auto" w:fill="FAF4E9"/>
+          </w:tcPr>
+          <w:p>
+            <w:pPr>
+              <w:jc w:val="left"/>
+            </w:pPr>
+            <w:r/>
+            <w:r>
+              <w:rPr>
+                <w:b w:val="0"/>
+                <w:sz w:val="17"/>
+              </w:rPr>
+              <w:t>A dish, a cook, a room worth celebrating — the everyday craft (the BBQ, the biscuit, the taco, the meat-and-three), all dayparts</w:t>
+            </w:r>
+          </w:p>
+        </w:tc>
+      </w:tr>
+      <w:tr>
+        <w:tc>
+          <w:tcPr>
+            <w:tcW w:type="dxa" w:w="2160"/>
+            <w:shd w:val="clear" w:color="auto" w:fill="FFFFFF"/>
+          </w:tcPr>
+          <w:p>
+            <w:pPr>
+              <w:jc w:val="left"/>
+            </w:pPr>
+            <w:r/>
+            <w:r>
+              <w:rPr>
+                <w:b/>
+                <w:color w:val="2A2420"/>
+                <w:sz w:val="17"/>
+              </w:rPr>
+              <w:t>The Pour</w:t>
+            </w:r>
+          </w:p>
+        </w:tc>
+        <w:tc>
+          <w:tcPr>
+            <w:tcW w:type="dxa" w:w="7488"/>
+            <w:shd w:val="clear" w:color="auto" w:fill="FFFFFF"/>
+          </w:tcPr>
+          <w:p>
+            <w:pPr>
+              <w:jc w:val="left"/>
+            </w:pPr>
+            <w:r/>
+            <w:r>
+              <w:rPr>
+                <w:b w:val="0"/>
+                <w:sz w:val="17"/>
+              </w:rPr>
+              <w:t>The wine, beer, bourbon — or great NA — worth seeking, with a credentialed reason why</w:t>
+            </w:r>
+          </w:p>
+        </w:tc>
+      </w:tr>
+      <w:tr>
+        <w:tc>
+          <w:tcPr>
+            <w:tcW w:type="dxa" w:w="2160"/>
+            <w:shd w:val="clear" w:color="auto" w:fill="FAF4E9"/>
+          </w:tcPr>
+          <w:p>
+            <w:pPr>
+              <w:jc w:val="left"/>
+            </w:pPr>
+            <w:r/>
+            <w:r>
+              <w:rPr>
+                <w:b/>
+                <w:color w:val="2A2420"/>
+                <w:sz w:val="17"/>
+              </w:rPr>
+              <w:t>The Maker / The Counter</w:t>
+            </w:r>
+          </w:p>
+        </w:tc>
+        <w:tc>
+          <w:tcPr>
+            <w:tcW w:type="dxa" w:w="7488"/>
+            <w:shd w:val="clear" w:color="auto" w:fill="FAF4E9"/>
+          </w:tcPr>
+          <w:p>
+            <w:pPr>
+              <w:jc w:val="left"/>
+            </w:pPr>
+            <w:r/>
+            <w:r>
+              <w:rPr>
+                <w:b w:val="0"/>
+                <w:sz w:val="17"/>
+              </w:rPr>
+              <w:t>The people behind it — chef, baker, roaster, bartender, monger, shop owner — craft &amp; personality, never cause</w:t>
+            </w:r>
+          </w:p>
+        </w:tc>
+      </w:tr>
+      <w:tr>
+        <w:tc>
+          <w:tcPr>
+            <w:tcW w:type="dxa" w:w="2160"/>
+            <w:shd w:val="clear" w:color="auto" w:fill="FFFFFF"/>
+          </w:tcPr>
+          <w:p>
+            <w:pPr>
+              <w:jc w:val="left"/>
+            </w:pPr>
+            <w:r/>
+            <w:r>
+              <w:rPr>
+                <w:b/>
+                <w:color w:val="2A2420"/>
+                <w:sz w:val="17"/>
+              </w:rPr>
+              <w:t>What's New</w:t>
+            </w:r>
+          </w:p>
+        </w:tc>
+        <w:tc>
+          <w:tcPr>
+            <w:tcW w:type="dxa" w:w="7488"/>
+            <w:shd w:val="clear" w:color="auto" w:fill="FFFFFF"/>
+          </w:tcPr>
+          <w:p>
+            <w:pPr>
+              <w:jc w:val="left"/>
+            </w:pPr>
+            <w:r/>
+            <w:r>
+              <w:rPr>
+                <w:b w:val="0"/>
+                <w:sz w:val="17"/>
+              </w:rPr>
+              <w:t>Openings &amp; what to order now — the freely-accessible service the paywall keeps from people</w:t>
+            </w:r>
+          </w:p>
+        </w:tc>
+      </w:tr>
+      <w:tr>
+        <w:tc>
+          <w:tcPr>
+            <w:tcW w:type="dxa" w:w="2160"/>
+            <w:shd w:val="clear" w:color="auto" w:fill="FAF4E9"/>
+          </w:tcPr>
+          <w:p>
+            <w:pPr>
+              <w:jc w:val="left"/>
+            </w:pPr>
+            <w:r/>
+            <w:r>
+              <w:rPr>
+                <w:b/>
+                <w:color w:val="2A2420"/>
+                <w:sz w:val="17"/>
+              </w:rPr>
+              <w:t>Host This</w:t>
+            </w:r>
+          </w:p>
+        </w:tc>
+        <w:tc>
+          <w:tcPr>
+            <w:tcW w:type="dxa" w:w="7488"/>
+            <w:shd w:val="clear" w:color="auto" w:fill="FAF4E9"/>
+          </w:tcPr>
+          <w:p>
+            <w:pPr>
+              <w:jc w:val="left"/>
+            </w:pPr>
+            <w:r/>
+            <w:r>
+              <w:rPr>
+                <w:b w:val="0"/>
+                <w:sz w:val="17"/>
+              </w:rPr>
+              <w:t>A pairing or hosting tip — 'mise en place' made practical for friends coming over</w:t>
+            </w:r>
+          </w:p>
+        </w:tc>
+      </w:tr>
+      <w:tr>
+        <w:tc>
+          <w:tcPr>
+            <w:tcW w:type="dxa" w:w="2160"/>
+            <w:shd w:val="clear" w:color="auto" w:fill="FFFFFF"/>
+          </w:tcPr>
+          <w:p>
+            <w:pPr>
+              <w:jc w:val="left"/>
+            </w:pPr>
+            <w:r/>
+            <w:r>
+              <w:rPr>
+                <w:b/>
+                <w:color w:val="2A2420"/>
+                <w:sz w:val="17"/>
+              </w:rPr>
+              <w:t>The Calendar</w:t>
+            </w:r>
+          </w:p>
+        </w:tc>
+        <w:tc>
+          <w:tcPr>
+            <w:tcW w:type="dxa" w:w="7488"/>
+            <w:shd w:val="clear" w:color="auto" w:fill="FFFFFF"/>
+          </w:tcPr>
+          <w:p>
+            <w:pPr>
+              <w:jc w:val="left"/>
+            </w:pPr>
+            <w:r/>
+            <w:r>
+              <w:rPr>
+                <w:b w:val="0"/>
+                <w:sz w:val="17"/>
+              </w:rPr>
+              <w:t>Tastings, dinners, releases, classes &amp; festivals — the events that also monetize</w:t>
+            </w:r>
+          </w:p>
+        </w:tc>
+      </w:tr>
+    </w:tbl>
+    <w:p>
+      <w:pPr>
+        <w:spacing w:after="40"/>
+      </w:pPr>
     </w:p>
     <w:p>
       <w:pPr>
@@ -771,7 +1373,7 @@
                 <w:b w:val="0"/>
                 <w:sz w:val="16"/>
               </w:rPr>
-              <w:t>Bottle shops (Riverside, Imbibe, Kanku's, Northshore, East Brainerd) · distilleries (Chattanooga Whiskey, Gate 11) · cookware (Good Kinsmen, The Kitchen Collection) · Bleu Fox cheese · coffee roasters (Velo, Goodman) · Niedlov's</w:t>
+              <w:t>Bottle shops (Riverside, Imbibe, Kanku's) · distilleries (Chattanooga Whiskey, Gate 11) · cookware (Good Kinsmen, The Kitchen Collection) · Bleu Fox cheese · coffee roasters (Velo, Goodman) · Niedlov's · restaurants &amp; cafés (now in scope)</w:t>
             </w:r>
           </w:p>
         </w:tc>
@@ -831,7 +1433,7 @@
                 <w:b w:val="0"/>
                 <w:sz w:val="16"/>
               </w:rPr>
-              <w:t>Breweries (Chattanooga Brewing, Hutton &amp; Smith, Naked River…) · wineries (Lookout, Georgia Winery, Beans Creek) · cooking schools (PastaNooga, Sweet &amp; Savory) · caterers/private chefs · festivals (SIPTN Wine Fest, Bacon &amp; Barrel)</w:t>
+              <w:t>Restaurants for wine dinners (the Pedestrian / Bill Reed model) · breweries · wineries (Lookout, Georgia Winery) · cooking schools (PastaNooga, Sweet &amp; Savory) · chefs/caterers · festivals (SIPTN, Bacon &amp; Barrel)</w:t>
             </w:r>
           </w:p>
         </w:tc>
@@ -891,328 +1493,7 @@
                 <w:b w:val="0"/>
                 <w:sz w:val="16"/>
               </w:rPr>
-              <w:t>Farms &amp; CSAs, Chattanooga Market &amp; Main Street Farmers Market, Crabtree Farms, micro-makers — credibility &amp; stories, not reliable cash</w:t>
-            </w:r>
-          </w:p>
-        </w:tc>
-      </w:tr>
-    </w:tbl>
-    <w:p>
-      <w:pPr>
-        <w:spacing w:after="40"/>
-      </w:pPr>
-    </w:p>
-    <w:p>
-      <w:pPr>
-        <w:spacing w:before="240" w:after="60"/>
-        <w:pBdr>
-          <w:bottom w:val="single" w:sz="6" w:space="2" w:color="B5722E"/>
-        </w:pBdr>
-      </w:pPr>
-      <w:r>
-        <w:rPr>
-          <w:b/>
-          <w:color w:val="6E2B39"/>
-          <w:sz w:val="29"/>
-        </w:rPr>
-        <w:t>The weekly — content architecture</w:t>
-      </w:r>
-    </w:p>
-    <w:tbl>
-      <w:tblPr>
-        <w:tblStyle w:val="TableGrid"/>
-        <w:tblW w:type="auto" w:w="0"/>
-        <w:jc w:val="center"/>
-        <w:tblLook w:firstColumn="1" w:firstRow="1" w:lastColumn="0" w:lastRow="0" w:noHBand="0" w:noVBand="1" w:val="04A0"/>
-      </w:tblPr>
-      <w:tblGrid>
-        <w:gridCol w:w="4896"/>
-        <w:gridCol w:w="4896"/>
-      </w:tblGrid>
-      <w:tr>
-        <w:tc>
-          <w:tcPr>
-            <w:tcW w:type="dxa" w:w="2016"/>
-            <w:shd w:val="clear" w:color="auto" w:fill="6E2B39"/>
-          </w:tcPr>
-          <w:p>
-            <w:pPr>
-              <w:jc w:val="left"/>
-            </w:pPr>
-            <w:r/>
-            <w:r>
-              <w:rPr>
-                <w:b/>
-                <w:color w:val="FFFFFF"/>
-                <w:sz w:val="17"/>
-              </w:rPr>
-              <w:t>Section</w:t>
-            </w:r>
-          </w:p>
-        </w:tc>
-        <w:tc>
-          <w:tcPr>
-            <w:tcW w:type="dxa" w:w="7632"/>
-            <w:shd w:val="clear" w:color="auto" w:fill="6E2B39"/>
-          </w:tcPr>
-          <w:p>
-            <w:pPr>
-              <w:jc w:val="left"/>
-            </w:pPr>
-            <w:r/>
-            <w:r>
-              <w:rPr>
-                <w:b/>
-                <w:color w:val="FFFFFF"/>
-                <w:sz w:val="17"/>
-              </w:rPr>
-              <w:t>The point of view</w:t>
-            </w:r>
-          </w:p>
-        </w:tc>
-      </w:tr>
-      <w:tr>
-        <w:tc>
-          <w:tcPr>
-            <w:tcW w:type="dxa" w:w="2016"/>
-            <w:shd w:val="clear" w:color="auto" w:fill="FAF4E9"/>
-          </w:tcPr>
-          <w:p>
-            <w:pPr>
-              <w:jc w:val="left"/>
-            </w:pPr>
-            <w:r/>
-            <w:r>
-              <w:rPr>
-                <w:b/>
-                <w:color w:val="2A2420"/>
-                <w:sz w:val="17"/>
-              </w:rPr>
-              <w:t>The Pour</w:t>
-            </w:r>
-          </w:p>
-        </w:tc>
-        <w:tc>
-          <w:tcPr>
-            <w:tcW w:type="dxa" w:w="7632"/>
-            <w:shd w:val="clear" w:color="auto" w:fill="FAF4E9"/>
-          </w:tcPr>
-          <w:p>
-            <w:pPr>
-              <w:jc w:val="left"/>
-            </w:pPr>
-            <w:r/>
-            <w:r>
-              <w:rPr>
-                <w:b w:val="0"/>
-                <w:sz w:val="17"/>
-              </w:rPr>
-              <w:t>The wine, beer, or bourbon worth seeking this week — a pick or a theme, with a real reason</w:t>
-            </w:r>
-          </w:p>
-        </w:tc>
-      </w:tr>
-      <w:tr>
-        <w:tc>
-          <w:tcPr>
-            <w:tcW w:type="dxa" w:w="2016"/>
-            <w:shd w:val="clear" w:color="auto" w:fill="FFFFFF"/>
-          </w:tcPr>
-          <w:p>
-            <w:pPr>
-              <w:jc w:val="left"/>
-            </w:pPr>
-            <w:r/>
-            <w:r>
-              <w:rPr>
-                <w:b/>
-                <w:color w:val="2A2420"/>
-                <w:sz w:val="17"/>
-              </w:rPr>
-              <w:t>The Shop / The Maker</w:t>
-            </w:r>
-          </w:p>
-        </w:tc>
-        <w:tc>
-          <w:tcPr>
-            <w:tcW w:type="dxa" w:w="7632"/>
-            <w:shd w:val="clear" w:color="auto" w:fill="FFFFFF"/>
-          </w:tcPr>
-          <w:p>
-            <w:pPr>
-              <w:jc w:val="left"/>
-            </w:pPr>
-            <w:r/>
-            <w:r>
-              <w:rPr>
-                <w:b w:val="0"/>
-                <w:sz w:val="17"/>
-              </w:rPr>
-              <w:t>The people behind the counter and the bottle — a featured bottle shop, brewer, distiller, or monger (the founder's 'got out of the house' joy)</w:t>
-            </w:r>
-          </w:p>
-        </w:tc>
-      </w:tr>
-      <w:tr>
-        <w:tc>
-          <w:tcPr>
-            <w:tcW w:type="dxa" w:w="2016"/>
-            <w:shd w:val="clear" w:color="auto" w:fill="FAF4E9"/>
-          </w:tcPr>
-          <w:p>
-            <w:pPr>
-              <w:jc w:val="left"/>
-            </w:pPr>
-            <w:r/>
-            <w:r>
-              <w:rPr>
-                <w:b/>
-                <w:color w:val="2A2420"/>
-                <w:sz w:val="17"/>
-              </w:rPr>
-              <w:t>What's Pouring</w:t>
-            </w:r>
-          </w:p>
-        </w:tc>
-        <w:tc>
-          <w:tcPr>
-            <w:tcW w:type="dxa" w:w="7632"/>
-            <w:shd w:val="clear" w:color="auto" w:fill="FAF4E9"/>
-          </w:tcPr>
-          <w:p>
-            <w:pPr>
-              <w:jc w:val="left"/>
-            </w:pPr>
-            <w:r/>
-            <w:r>
-              <w:rPr>
-                <w:b w:val="0"/>
-                <w:sz w:val="17"/>
-              </w:rPr>
-              <w:t>Seasonal — what to drink now, and what's new on local shelves &amp; taps</w:t>
-            </w:r>
-          </w:p>
-        </w:tc>
-      </w:tr>
-      <w:tr>
-        <w:tc>
-          <w:tcPr>
-            <w:tcW w:type="dxa" w:w="2016"/>
-            <w:shd w:val="clear" w:color="auto" w:fill="FFFFFF"/>
-          </w:tcPr>
-          <w:p>
-            <w:pPr>
-              <w:jc w:val="left"/>
-            </w:pPr>
-            <w:r/>
-            <w:r>
-              <w:rPr>
-                <w:b/>
-                <w:color w:val="2A2420"/>
-                <w:sz w:val="17"/>
-              </w:rPr>
-              <w:t>The Table</w:t>
-            </w:r>
-          </w:p>
-        </w:tc>
-        <w:tc>
-          <w:tcPr>
-            <w:tcW w:type="dxa" w:w="7632"/>
-            <w:shd w:val="clear" w:color="auto" w:fill="FFFFFF"/>
-          </w:tcPr>
-          <w:p>
-            <w:pPr>
-              <w:jc w:val="left"/>
-            </w:pPr>
-            <w:r/>
-            <w:r>
-              <w:rPr>
-                <w:b w:val="0"/>
-                <w:sz w:val="17"/>
-              </w:rPr>
-              <w:t>The food halo — a pairing, a dish, or where to drink well (Michelin/Beard rooms)</w:t>
-            </w:r>
-          </w:p>
-        </w:tc>
-      </w:tr>
-      <w:tr>
-        <w:tc>
-          <w:tcPr>
-            <w:tcW w:type="dxa" w:w="2016"/>
-            <w:shd w:val="clear" w:color="auto" w:fill="FAF4E9"/>
-          </w:tcPr>
-          <w:p>
-            <w:pPr>
-              <w:jc w:val="left"/>
-            </w:pPr>
-            <w:r/>
-            <w:r>
-              <w:rPr>
-                <w:b/>
-                <w:color w:val="2A2420"/>
-                <w:sz w:val="17"/>
-              </w:rPr>
-              <w:t>Host This</w:t>
-            </w:r>
-          </w:p>
-        </w:tc>
-        <w:tc>
-          <w:tcPr>
-            <w:tcW w:type="dxa" w:w="7632"/>
-            <w:shd w:val="clear" w:color="auto" w:fill="FAF4E9"/>
-          </w:tcPr>
-          <w:p>
-            <w:pPr>
-              <w:jc w:val="left"/>
-            </w:pPr>
-            <w:r/>
-            <w:r>
-              <w:rPr>
-                <w:b w:val="0"/>
-                <w:sz w:val="17"/>
-              </w:rPr>
-              <w:t>A hosting/pairing tip for entertaining — 'mise en place' made practical</w:t>
-            </w:r>
-          </w:p>
-        </w:tc>
-      </w:tr>
-      <w:tr>
-        <w:tc>
-          <w:tcPr>
-            <w:tcW w:type="dxa" w:w="2016"/>
-            <w:shd w:val="clear" w:color="auto" w:fill="FFFFFF"/>
-          </w:tcPr>
-          <w:p>
-            <w:pPr>
-              <w:jc w:val="left"/>
-            </w:pPr>
-            <w:r/>
-            <w:r>
-              <w:rPr>
-                <w:b/>
-                <w:color w:val="2A2420"/>
-                <w:sz w:val="17"/>
-              </w:rPr>
-              <w:t>The Calendar</w:t>
-            </w:r>
-          </w:p>
-        </w:tc>
-        <w:tc>
-          <w:tcPr>
-            <w:tcW w:type="dxa" w:w="7632"/>
-            <w:shd w:val="clear" w:color="auto" w:fill="FFFFFF"/>
-          </w:tcPr>
-          <w:p>
-            <w:pPr>
-              <w:jc w:val="left"/>
-            </w:pPr>
-            <w:r/>
-            <w:r>
-              <w:rPr>
-                <w:b w:val="0"/>
-                <w:sz w:val="17"/>
-              </w:rPr>
-              <w:t>Upcoming tastings, dinners, releases &amp; festivals — the events that also monetize</w:t>
+              <w:t>Farms &amp; CSAs, Chattanooga Market &amp; Main Street Farmers Market, micro-makers — stories &amp; credibility, not reliable cash</w:t>
             </w:r>
           </w:p>
         </w:tc>
@@ -1249,52 +1530,13 @@
           <w:b/>
           <w:sz w:val="19"/>
         </w:rPr>
-        <w:t>Alcohol advertising is regulated (TABC).</w:t>
+        <w:t>Stay celebratory, not a listings sheet.</w:t>
       </w:r>
       <w:r>
         <w:rPr>
           <w:sz w:val="19"/>
         </w:rPr>
-        <w:t xml:space="preserve"> Good news: the rules </w:t>
-      </w:r>
-      <w:r>
-        <w:rPr>
-          <w:b/>
-          <w:sz w:val="19"/>
-        </w:rPr>
-        <w:t>explicitly permit email-list promotion</w:t>
-      </w:r>
-      <w:r>
-        <w:rPr>
-          <w:sz w:val="19"/>
-        </w:rPr>
-        <w:t xml:space="preserve"> by wine/spirits retailers — favorable for the bottle-shop model. Cautions: keep </w:t>
-      </w:r>
-      <w:r>
-        <w:rPr>
-          <w:b/>
-          <w:sz w:val="19"/>
-        </w:rPr>
-        <w:t>manufacturer (brewery/distillery) money separate from retailer (bottle-shop) slots</w:t>
-      </w:r>
-      <w:r>
-        <w:rPr>
-          <w:sz w:val="19"/>
-        </w:rPr>
-        <w:t xml:space="preserve"> (tied-house rules); host tastings </w:t>
-      </w:r>
-      <w:r>
-        <w:rPr>
-          <w:b/>
-          <w:sz w:val="19"/>
-        </w:rPr>
-        <w:t>through the licensed partner</w:t>
-      </w:r>
-      <w:r>
-        <w:rPr>
-          <w:sz w:val="19"/>
-        </w:rPr>
-        <w:t xml:space="preserve"> so the license sits with them. A short TN-attorney check before launch.</w:t>
+        <w:t xml:space="preserve"> The value is craft, people, and a point of view — not a directory NOOGAtoday already runs.</w:t>
       </w:r>
     </w:p>
     <w:p>
@@ -1307,13 +1549,51 @@
           <w:b/>
           <w:sz w:val="19"/>
         </w:rPr>
-        <w:t>Don't drift back to general food.</w:t>
+        <w:t>Apolitical by design</w:t>
       </w:r>
       <w:r>
         <w:rPr>
           <w:sz w:val="19"/>
         </w:rPr>
-        <w:t xml:space="preserve"> The moment MeP becomes 'another Chattanooga food newsletter,' it's the weakest of four. Drinks-and-table, with food as the halo.</w:t>
+        <w:t xml:space="preserve"> — the inverse of the activist lane; it's also the more sponsorable and more shareable choice.</w:t>
+      </w:r>
+    </w:p>
+    <w:p>
+      <w:pPr>
+        <w:pStyle w:val="ListBullet"/>
+        <w:spacing w:after="60"/>
+      </w:pPr>
+      <w:r>
+        <w:rPr>
+          <w:b/>
+          <w:sz w:val="19"/>
+        </w:rPr>
+        <w:t>Alcohol advertising (TABC)</w:t>
+      </w:r>
+      <w:r>
+        <w:rPr>
+          <w:sz w:val="19"/>
+        </w:rPr>
+        <w:t xml:space="preserve"> still applies to the drinks side &amp; events: email-list promotion by retailers is permitted; keep manufacturer vs. retailer slots separate; host tastings through the licensed partner. A short TN-attorney check before launch.</w:t>
+      </w:r>
+    </w:p>
+    <w:p>
+      <w:pPr>
+        <w:pStyle w:val="ListBullet"/>
+        <w:spacing w:after="60"/>
+      </w:pPr>
+      <w:r>
+        <w:rPr>
+          <w:b/>
+          <w:sz w:val="19"/>
+        </w:rPr>
+        <w:t>Name vetting</w:t>
+      </w:r>
+      <w:r>
+        <w:rPr>
+          <w:sz w:val="19"/>
+        </w:rPr>
+        <w:t xml:space="preserve"> — 'Mise en Place' is a common culinary term; run the domain + USPTO/TESS pass we used for SCI. Also avoid 'The Table' as any MeP feature name — it's Food as a Verb's membership brand.</w:t>
       </w:r>
     </w:p>
     <w:p>
@@ -1333,25 +1613,6 @@
           <w:sz w:val="19"/>
         </w:rPr>
         <w:t xml:space="preserve"> — lean on the events margin, not premium ad rates.</w:t>
-      </w:r>
-    </w:p>
-    <w:p>
-      <w:pPr>
-        <w:pStyle w:val="ListBullet"/>
-        <w:spacing w:after="60"/>
-      </w:pPr>
-      <w:r>
-        <w:rPr>
-          <w:b/>
-          <w:sz w:val="19"/>
-        </w:rPr>
-        <w:t>Name vetting</w:t>
-      </w:r>
-      <w:r>
-        <w:rPr>
-          <w:sz w:val="19"/>
-        </w:rPr>
-        <w:t xml:space="preserve"> — 'Mise en Place' is a common culinary term (catering/meal-prep businesses use it). Run the same domain + USPTO/TESS pass we used for SCI before committing; 'MeP' is a working name only.</w:t>
       </w:r>
     </w:p>
     <w:sectPr>

</xml_diff>